<commit_message>
feat: implement backend API with authentication and vehicle management modules
</commit_message>
<xml_diff>
--- a/docs/ecoVolt-finder-Ideation-Report.docx
+++ b/docs/ecoVolt-finder-Ideation-Report.docx
@@ -17,7 +17,7 @@
     </w:p>
     <w:p>
       <w:pPr>
-        <w:spacing w:after="320"/>
+        <w:spacing w:after="280"/>
         <w:jc w:val="center"/>
       </w:pPr>
       <w:r>
@@ -256,79 +256,67 @@
           <w:color w:val="000000"/>
           <w:sz w:val="28"/>
         </w:rPr>
-        <w:t>3. Proposed Solution &amp; Basic Workflow</w:t>
+        <w:t>3. Proposed Solution &amp; End-to-End Workflow</w:t>
       </w:r>
     </w:p>
     <w:p>
       <w:r>
-        <w:t>ecoVolt-finder creates a closed-loop data pipeline bridging drivers, charging station operators, and the regional power grid.</w:t>
+        <w:t>ecoVolt-finder creates a closed-loop data pipeline bridging drivers, charging station operators, and the regional power grid. The complete 5-step operational workflow is illustrated below:</w:t>
       </w:r>
     </w:p>
-    <w:tbl>
-      <w:tblPr>
-        <w:tblW w:type="auto" w:w="0"/>
+    <w:p>
+      <w:pPr>
+        <w:spacing w:before="120" w:after="80"/>
         <w:jc w:val="center"/>
-        <w:tblLook w:firstColumn="1" w:firstRow="1" w:lastColumn="0" w:lastRow="0" w:noHBand="0" w:noVBand="1" w:val="04A0"/>
-      </w:tblPr>
-      <w:tblGrid>
-        <w:gridCol w:w="9360"/>
-      </w:tblGrid>
-      <w:tr>
-        <w:tc>
-          <w:tcPr>
-            <w:tcW w:type="dxa" w:w="9360"/>
-            <w:tcBorders>
-              <w:top w:val="single" w:sz="6" w:space="0" w:color="000000"/>
-              <w:left w:val="single" w:sz="6" w:space="0" w:color="000000"/>
-              <w:bottom w:val="single" w:sz="6" w:space="0" w:color="000000"/>
-              <w:right w:val="single" w:sz="6" w:space="0" w:color="000000"/>
-            </w:tcBorders>
-          </w:tcPr>
-          <w:p>
-            <w:pPr>
-              <w:spacing w:line="276" w:lineRule="auto"/>
-            </w:pPr>
-            <w:r>
-              <w:rPr>
-                <w:rFonts w:ascii="Consolas" w:hAnsi="Consolas"/>
-                <w:sz w:val="19"/>
-              </w:rPr>
-              <w:t>STEP 1: DRIVER CONNECTS &amp; SEARCHES</w:t>
-              <w:br/>
-              <w:t xml:space="preserve">  • Driver inputs destination / requests top-up via mobile app.</w:t>
-              <w:br/>
-              <w:t xml:space="preserve">  • App reads vehicle profile (battery capacity kWh, efficiency Wh/km, current SoC %).</w:t>
-              <w:br/>
-              <w:br/>
-              <w:t>STEP 2: REAL-TIME GRID &amp; PRICING INGESTION</w:t>
-              <w:br/>
-              <w:t xml:space="preserve">  • Backend &amp; ML service fetch live regional grid mix (Solar, Wind, Hydro, Thermal) &amp; carbon intensity.</w:t>
-              <w:br/>
-              <w:t xml:space="preserve">  • Pricing engine computes base DISCOM tariff + manager markup + dynamic green discount.</w:t>
-              <w:br/>
-              <w:br/>
-              <w:t>STEP 3: TRUE TOTAL COST COMPUTATION &amp; RECOMMENDATION</w:t>
-              <w:br/>
-              <w:t xml:space="preserve">  • System evaluates True Total Cost = Charging Cost (₹) + Vehicle Travel Cost (₹).</w:t>
-              <w:br/>
-              <w:t xml:space="preserve">  • Candidate stations ranked by true economic &amp; environmental net benefit.</w:t>
-              <w:br/>
-              <w:br/>
-              <w:t>STEP 4: SMART CHARGE SCHEDULING &amp; PRICE LOCK</w:t>
-              <w:br/>
-              <w:t xml:space="preserve">  • Driver selects optimal renewable charging window (or urgent override).</w:t>
-              <w:br/>
-              <w:t xml:space="preserve">  • Quoted rate is cryptographically price-locked until session completion.</w:t>
-              <w:br/>
-              <w:br/>
-              <w:t>STEP 5: TELEMETRY &amp; EMISSIONS IMPACT REPORTING</w:t>
-              <w:br/>
-              <w:t xml:space="preserve">  • Live tracking of kWh delivered, cost accrued at locked price, and CO2 emissions avoided vs. grid baseline.</w:t>
-            </w:r>
-          </w:p>
-        </w:tc>
-      </w:tr>
-    </w:tbl>
+      </w:pPr>
+      <w:r>
+        <w:drawing>
+          <wp:inline xmlns:a="http://schemas.openxmlformats.org/drawingml/2006/main" xmlns:pic="http://schemas.openxmlformats.org/drawingml/2006/picture">
+            <wp:extent cx="5669280" cy="6236208"/>
+            <wp:docPr id="1" name="Picture 1"/>
+            <wp:cNvGraphicFramePr>
+              <a:graphicFrameLocks noChangeAspect="1"/>
+            </wp:cNvGraphicFramePr>
+            <a:graphic>
+              <a:graphicData uri="http://schemas.openxmlformats.org/drawingml/2006/picture">
+                <pic:pic>
+                  <pic:nvPicPr>
+                    <pic:cNvPr id="0" name="workflow_flowchart.png"/>
+                    <pic:cNvPicPr/>
+                  </pic:nvPicPr>
+                  <pic:blipFill>
+                    <a:blip r:embed="rId9"/>
+                    <a:stretch>
+                      <a:fillRect/>
+                    </a:stretch>
+                  </pic:blipFill>
+                  <pic:spPr>
+                    <a:xfrm>
+                      <a:off x="0" y="0"/>
+                      <a:ext cx="5669280" cy="6236208"/>
+                    </a:xfrm>
+                    <a:prstGeom prst="rect"/>
+                  </pic:spPr>
+                </pic:pic>
+              </a:graphicData>
+            </a:graphic>
+          </wp:inline>
+        </w:drawing>
+      </w:r>
+    </w:p>
+    <w:p>
+      <w:pPr>
+        <w:spacing w:after="200"/>
+        <w:jc w:val="center"/>
+      </w:pPr>
+      <w:r>
+        <w:rPr>
+          <w:i/>
+          <w:sz w:val="19"/>
+        </w:rPr>
+        <w:t>Figure 1: ecoVolt-finder 5-Step Operational Flowchart (Driver Discovery to Telemetry)</w:t>
+      </w:r>
+    </w:p>
     <w:p>
       <w:pPr>
         <w:keepNext/>
@@ -561,7 +549,65 @@
           <w:color w:val="000000"/>
           <w:sz w:val="28"/>
         </w:rPr>
-        <w:t>5. Technology Stack &amp; Architecture</w:t>
+        <w:t>5. Technology Stack &amp; Monorepo Architecture</w:t>
+      </w:r>
+    </w:p>
+    <w:p>
+      <w:r>
+        <w:t>The project is structured as a conflict-free monorepo divided into three distinct service domains with strict interface contracts:</w:t>
+      </w:r>
+    </w:p>
+    <w:p>
+      <w:pPr>
+        <w:spacing w:before="120" w:after="80"/>
+        <w:jc w:val="center"/>
+      </w:pPr>
+      <w:r>
+        <w:drawing>
+          <wp:inline xmlns:a="http://schemas.openxmlformats.org/drawingml/2006/main" xmlns:pic="http://schemas.openxmlformats.org/drawingml/2006/picture">
+            <wp:extent cx="5669280" cy="3685032"/>
+            <wp:docPr id="2" name="Picture 2"/>
+            <wp:cNvGraphicFramePr>
+              <a:graphicFrameLocks noChangeAspect="1"/>
+            </wp:cNvGraphicFramePr>
+            <a:graphic>
+              <a:graphicData uri="http://schemas.openxmlformats.org/drawingml/2006/picture">
+                <pic:pic>
+                  <pic:nvPicPr>
+                    <pic:cNvPr id="0" name="architecture_flowchart.png"/>
+                    <pic:cNvPicPr/>
+                  </pic:nvPicPr>
+                  <pic:blipFill>
+                    <a:blip r:embed="rId10"/>
+                    <a:stretch>
+                      <a:fillRect/>
+                    </a:stretch>
+                  </pic:blipFill>
+                  <pic:spPr>
+                    <a:xfrm>
+                      <a:off x="0" y="0"/>
+                      <a:ext cx="5669280" cy="3685032"/>
+                    </a:xfrm>
+                    <a:prstGeom prst="rect"/>
+                  </pic:spPr>
+                </pic:pic>
+              </a:graphicData>
+            </a:graphic>
+          </wp:inline>
+        </w:drawing>
+      </w:r>
+    </w:p>
+    <w:p>
+      <w:pPr>
+        <w:spacing w:after="200"/>
+        <w:jc w:val="center"/>
+      </w:pPr>
+      <w:r>
+        <w:rPr>
+          <w:i/>
+          <w:sz w:val="19"/>
+        </w:rPr>
+        <w:t>Figure 2: ecoVolt-finder Monorepo Architecture &amp; Cross-Service Data Seams</w:t>
       </w:r>
     </w:p>
     <w:tbl>

</xml_diff>